<commit_message>
Add sanitized report files
</commit_message>
<xml_diff>
--- a/method_report.docx
+++ b/method_report.docx
@@ -21,7 +21,7 @@
           <w:sz w:val="28"/>
           <w:szCs w:val="28"/>
         </w:rPr>
-        <w:t>项目说明：中医辨证系统实现</w:t>
+        <w:t>项目说明：提示词工程实验</w:t>
       </w:r>
     </w:p>
     <w:p>
@@ -88,7 +88,7 @@
           <w:szCs w:val="28"/>
           <w:lang w:val="en-US" w:eastAsia="zh-CN" w:bidi="ar"/>
         </w:rPr>
-        <w:t>本项目希望构建一个针对慢性淋巴细胞白血病的中医智能辨证系统，能够根据患者症状描述自动匹配证型和治法，实现症状-证型-治法的全流程自动匹配，具体目标包括：</w:t>
+        <w:t>本项目希望构建一个针对慢性淋巴细胞白血病的提示词工程实验流程，能够根据患者症状描述自动匹配证型和治法，实现症状-证型-治法的全流程自动匹配，具体目标包括：</w:t>
       </w:r>
     </w:p>
     <w:p>
@@ -1797,7 +1797,7 @@
           <w:u w:val="none"/>
           <w:lang w:val="en-US" w:eastAsia="zh-CN"/>
         </w:rPr>
-        <w:t>通过上述四种策略的尝试，我们可以对不同提示工程方法在中医辨证任务中的效果进行系统性对比。各策略在准确性、稳定性、可解释性及实现复杂度等方面表现如下：</w:t>
+        <w:t>通过上述四种策略的尝试，我们可以对不同提示工程方法在提示词工程任务中的效果进行系统性对比。各策略在准确性、稳定性、可解释性及实现复杂度等方面表现如下：</w:t>
       </w:r>
     </w:p>
     <w:tbl>
@@ -3412,7 +3412,7 @@
           <w:szCs w:val="28"/>
           <w:lang w:val="en-US" w:eastAsia="zh-CN"/>
         </w:rPr>
-        <w:t>增强了结果的可靠性与可信度：从业务的角度看，中医辨证讲究“理法方药”的连贯性与一致性。Self-Consistency机制要求模型从多个角度“思考”同一问题，只有当多数推理路径指向同一证型和治法时，该结果才会被采纳。这种“多路径验证”过程模拟了专家会诊或重复检验的思想，使得最终输出不再是单一的、可能受偶然因素影响的判断，而是经过内部交叉验证的、更可信的结论。</w:t>
+        <w:t>增强了结果的可靠性与可信度：从业务的角度看，提示词工程讲究“理法方药”的连贯性与一致性。Self-Consistency机制要求模型从多个角度“思考”同一问题，只有当多数推理路径指向同一证型和治法时，该结果才会被采纳。这种“多路径验证”过程模拟了专家会诊或重复检验的思想，使得最终输出不再是单一的、可能受偶然因素影响的判断，而是经过内部交叉验证的、更可信的结论。</w:t>
       </w:r>
     </w:p>
     <w:p>

</xml_diff>